<commit_message>
Methods record of generative AI use; availability statement cites the all-versions DOI
</commit_message>
<xml_diff>
--- a/manuscript/EE_Manuscript.docx
+++ b/manuscript/EE_Manuscript.docx
@@ -1031,6 +1031,19 @@
     <w:p>
       <w:r>
         <w:t>The independent residential records come from StoreNet, which provides direct consumption and generation power measurements for an Irish energy community [31]. We inspect all 20 household files and retain the ten households with verified PV production. The downloaded power pipeline supplies minute-grid records, and its missing values remain missing: we retain half hours with at least 27 valid minute observations out of 30 in each required power channel and average the available observations without interpolation. Target days require all 48 retained half hours and complete preceding retained histories of seven days, which yields 2,224 paired household-days in 2020. The interpolated cumulative-energy files are not used, and the study battery is simulated from gross consumption and production.</w:t>
+      </w:r>
+    </w:p>
+    <w:p>
+      <w:pPr>
+        <w:pStyle w:val="Heading2"/>
+      </w:pPr>
+      <w:r>
+        <w:t>2.9. Generative AI use</w:t>
+      </w:r>
+    </w:p>
+    <w:p>
+      <w:r>
+        <w:t>OpenAI Codex (GPT-5 class model) was used between 5 and 9 October 2026 for limited Python code assistance and English language polishing. It helped implement the analysis and figure scripts and polish the wording of the Methods and Results text. All substantive research tasks, including study design, data collection and processing, analysis, interpretation and manuscript preparation, were performed by the author. Every assisted output was validated by rerunning the scripts and recomputing the reported costs, state transitions and power-flow checks against saved outputs. The study uses publicly distributed, non-identifiable measurement records together with simulated batteries and public feeder models, so no sensitive, proprietary or human-subject data were involved.</w:t>
       </w:r>
     </w:p>
     <w:p>
@@ -4806,7 +4819,7 @@
     </w:p>
     <w:p>
       <w:r>
-        <w:t>The Ausgrid solar home electricity records are publicly distributed, and the StoreNet records and documentation are openly available. The European low-voltage benchmark and the SimBench networks are published technical benchmarks. The analysis code, trained checkpoints, processed household panel, network models and result records that regenerate every table and figure, together with the manuscript sources, are archived at https://doi.org/10.5281/zenodo.23255705 (Zenodo, all versions 10.5281/zenodo.23255308), with the development history at https://github.com/williamjay1/pv-battery-dfl-grid.</w:t>
+        <w:t>The Ausgrid solar home electricity records are publicly distributed, and the StoreNet records and documentation are openly available. The European low-voltage benchmark and the SimBench networks are published technical benchmarks. The analysis code, trained checkpoints, processed household panel, network models and result records that regenerate every table and figure, together with the manuscript sources, are archived on Zenodo at https://doi.org/10.5281/zenodo.23255308 under the release tag v1.0.4, with the development history at https://github.com/williamjay1/pv-battery-dfl-grid.</w:t>
       </w:r>
     </w:p>
     <w:p>

</xml_diff>

<commit_message>
Record Codex dates as 9-10 October 2026; availability statement cites Zenodo only
</commit_message>
<xml_diff>
--- a/manuscript/EE_Manuscript.docx
+++ b/manuscript/EE_Manuscript.docx
@@ -1043,7 +1043,7 @@
     </w:p>
     <w:p>
       <w:r>
-        <w:t>OpenAI Codex (GPT-5 class model) was used between 5 and 9 October 2026 for limited Python code assistance and English language polishing. It helped implement the analysis and figure scripts and polish the wording of the Methods and Results text. All substantive research tasks, including study design, data collection and processing, analysis, interpretation and manuscript preparation, were performed by the author. Every assisted output was validated by rerunning the scripts and recomputing the reported costs, state transitions and power-flow checks against saved outputs. The study uses publicly distributed, non-identifiable measurement records together with simulated batteries and public feeder models, so no sensitive, proprietary or human-subject data were involved.</w:t>
+        <w:t>OpenAI Codex (GPT-5) was used between 9 and 10 October 2026 for limited Python code assistance and English language polishing. It helped implement the analysis and figure scripts and polish the wording of the manuscript text. All substantive research tasks, including study design, data processing, analysis, interpretation and manuscript preparation, were performed by the author. Every assisted output was validated by rerunning the scripts and recomputing the reported costs, state transitions and power-flow checks against saved outputs. The study uses publicly distributed, non-identifiable measurement records together with simulated batteries and public feeder models, so no sensitive, proprietary or human-subject data were involved.</w:t>
       </w:r>
     </w:p>
     <w:p>
@@ -4819,7 +4819,7 @@
     </w:p>
     <w:p>
       <w:r>
-        <w:t>The Ausgrid solar home electricity records are publicly distributed, and the StoreNet records and documentation are openly available. The European low-voltage benchmark and the SimBench networks are published technical benchmarks. The analysis code, trained checkpoints, processed household panel, network models and result records that regenerate every table and figure, together with the manuscript sources, are archived on Zenodo at https://doi.org/10.5281/zenodo.23255308 under the release tag v1.0.4, with the development history at https://github.com/williamjay1/pv-battery-dfl-grid.</w:t>
+        <w:t>The Ausgrid solar home electricity records are publicly distributed, and the StoreNet records and documentation are openly available. The European low-voltage benchmark and the SimBench networks are published technical benchmarks. The analysis code, trained checkpoints, processed household panel, network models and result records that regenerate every table and figure are archived on Zenodo at https://doi.org/10.5281/zenodo.23255308.</w:t>
       </w:r>
     </w:p>
     <w:p>
@@ -4829,7 +4829,7 @@
     </w:p>
     <w:p>
       <w:r>
-        <w:t>OpenAI Codex (GPT-5 class model) was used on 5 to 9 October 2026 for limited Python code assistance and English language polishing. It helped implement the analysis and figure scripts and polish the wording of the Methods and Results text. All substantive research tasks, including study design, data collection and processing, analysis, interpretation and manuscript preparation, were performed by the author. Every assisted output was validated by rerunning the analysis scripts and recomputing the reported costs, state transitions and power-flow checks against saved outputs. The study uses publicly distributed, non-identifiable measurement data together with simulated batteries and public feeder models, so no sensitive, proprietary or human-subject data were involved. AI did not generate or alter data or determine conclusions, and the author takes full responsibility for the manuscript.</w:t>
+        <w:t>OpenAI Codex (GPT-5) was used between 9 and 10 October 2026 for limited Python code assistance and English language polishing. It helped implement the analysis and figure scripts and polish the wording of the manuscript text. All substantive research tasks, including study design, data processing, analysis, interpretation and manuscript preparation, were performed by the author. Every assisted output was validated by rerunning the scripts and recomputing the reported costs, state transitions and power-flow checks against saved outputs. The study uses publicly distributed, non-identifiable measurement records together with simulated batteries and public feeder models, so no sensitive, proprietary or human-subject data were involved. AI did not generate or alter data or determine conclusions, and the author takes full responsibility for the manuscript.</w:t>
       </w:r>
     </w:p>
     <w:p>

</xml_diff>

<commit_message>
Name the affected sections in the AI-use record
</commit_message>
<xml_diff>
--- a/manuscript/EE_Manuscript.docx
+++ b/manuscript/EE_Manuscript.docx
@@ -1043,7 +1043,7 @@
     </w:p>
     <w:p>
       <w:r>
-        <w:t>OpenAI Codex (GPT-5) was used between 9 and 10 October 2026 for limited Python code assistance and English language polishing. It helped implement the analysis and figure scripts and polish the wording of the manuscript text. All substantive research tasks, including study design, data processing, analysis, interpretation and manuscript preparation, were performed by the author. Every assisted output was validated by rerunning the scripts and recomputing the reported costs, state transitions and power-flow checks against saved outputs. The study uses publicly distributed, non-identifiable measurement records together with simulated batteries and public feeder models, so no sensitive, proprietary or human-subject data were involved.</w:t>
+        <w:t>OpenAI Codex (GPT-5) was used between 9 and 10 October 2026 for limited Python code assistance and English language polishing. It helped implement the analysis and figure scripts and polish the wording of the Methods and Results sections. All substantive research tasks, including study design, data processing, analysis, interpretation and manuscript preparation, were performed by the author. Every assisted output was validated by rerunning the scripts and recomputing the reported costs, state transitions and power-flow checks against saved outputs. The study uses publicly distributed, non-identifiable measurement records together with simulated batteries and public feeder models, so no sensitive, proprietary or human-subject data were involved.</w:t>
       </w:r>
     </w:p>
     <w:p>
@@ -4829,7 +4829,7 @@
     </w:p>
     <w:p>
       <w:r>
-        <w:t>OpenAI Codex (GPT-5) was used between 9 and 10 October 2026 for limited Python code assistance and English language polishing. It helped implement the analysis and figure scripts and polish the wording of the manuscript text. All substantive research tasks, including study design, data processing, analysis, interpretation and manuscript preparation, were performed by the author. Every assisted output was validated by rerunning the scripts and recomputing the reported costs, state transitions and power-flow checks against saved outputs. The study uses publicly distributed, non-identifiable measurement records together with simulated batteries and public feeder models, so no sensitive, proprietary or human-subject data were involved. AI did not generate or alter data or determine conclusions, and the author takes full responsibility for the manuscript.</w:t>
+        <w:t>OpenAI Codex (GPT-5) was used between 9 and 10 October 2026 for limited Python code assistance and English language polishing. It helped implement the analysis and figure scripts and polish the wording of the Methods and Results sections. All substantive research tasks, including study design, data processing, analysis, interpretation and manuscript preparation, were performed by the author. Every assisted output was validated by rerunning the scripts and recomputing the reported costs, state transitions and power-flow checks against saved outputs. The study uses publicly distributed, non-identifiable measurement records together with simulated batteries and public feeder models, so no sensitive, proprietary or human-subject data were involved. AI did not generate or alter data or determine conclusions, and the author takes full responsibility for the manuscript.</w:t>
       </w:r>
     </w:p>
     <w:p>

</xml_diff>